<commit_message>
Replace the questionnaire inside the pillar subpages
</commit_message>
<xml_diff>
--- a/dist/docs/materials/tmf_blank_01_entire_market_architecture.docx
+++ b/dist/docs/materials/tmf_blank_01_entire_market_architecture.docx
@@ -43,16 +43,7 @@
             <w:shd w:fill="156A84"/>
           </w:tcPr>
           <w:p>
-            <w:pPr>
-              <w:spacing w:after="0" w:before="0" w:line="240" w:lineRule="auto"/>
-              <w:jc w:val="center"/>
-            </w:pPr>
-            <w:r/>
             <w:r>
-              <w:rPr>
-                <w:b/>
-                <w:sz w:val="15"/>
-              </w:rPr>
               <w:t>Feature</w:t>
             </w:r>
           </w:p>
@@ -64,16 +55,7 @@
             <w:shd w:fill="156A84"/>
           </w:tcPr>
           <w:p>
-            <w:pPr>
-              <w:spacing w:after="0" w:before="0" w:line="240" w:lineRule="auto"/>
-              <w:jc w:val="center"/>
-            </w:pPr>
-            <w:r/>
             <w:r>
-              <w:rPr>
-                <w:b/>
-                <w:sz w:val="15"/>
-              </w:rPr>
               <w:t>Sub-feature</w:t>
             </w:r>
           </w:p>
@@ -85,17 +67,8 @@
             <w:shd w:fill="156A84"/>
           </w:tcPr>
           <w:p>
-            <w:pPr>
-              <w:spacing w:after="0" w:before="0" w:line="240" w:lineRule="auto"/>
-              <w:jc w:val="center"/>
-            </w:pPr>
-            <w:r/>
             <w:r>
-              <w:rPr>
-                <w:b/>
-                <w:sz w:val="15"/>
-              </w:rPr>
-              <w:t>ESP: LT-D-P-A</w:t>
+              <w:t>Market 1</w:t>
             </w:r>
           </w:p>
         </w:tc>
@@ -106,17 +79,8 @@
             <w:shd w:fill="156A84"/>
           </w:tcPr>
           <w:p>
-            <w:pPr>
-              <w:spacing w:after="0" w:before="0" w:line="240" w:lineRule="auto"/>
-              <w:jc w:val="center"/>
-            </w:pPr>
-            <w:r/>
             <w:r>
-              <w:rPr>
-                <w:b/>
-                <w:sz w:val="15"/>
-              </w:rPr>
-              <w:t>ESP: LT-D-P-AE</w:t>
+              <w:t>Market 2</w:t>
             </w:r>
           </w:p>
         </w:tc>
@@ -127,17 +91,8 @@
             <w:shd w:fill="156A84"/>
           </w:tcPr>
           <w:p>
-            <w:pPr>
-              <w:spacing w:after="0" w:before="0" w:line="240" w:lineRule="auto"/>
-              <w:jc w:val="center"/>
-            </w:pPr>
-            <w:r/>
             <w:r>
-              <w:rPr>
-                <w:b/>
-                <w:sz w:val="15"/>
-              </w:rPr>
-              <w:t>ESP: ST-D-P-E</w:t>
+              <w:t>Market 3</w:t>
             </w:r>
           </w:p>
         </w:tc>
@@ -148,17 +103,8 @@
             <w:shd w:fill="156A84"/>
           </w:tcPr>
           <w:p>
-            <w:pPr>
-              <w:spacing w:after="0" w:before="0" w:line="240" w:lineRule="auto"/>
-              <w:jc w:val="center"/>
-            </w:pPr>
-            <w:r/>
             <w:r>
-              <w:rPr>
-                <w:b/>
-                <w:sz w:val="15"/>
-              </w:rPr>
-              <w:t>ESP: RT-D-P-E</w:t>
+              <w:t>Market 4</w:t>
             </w:r>
           </w:p>
         </w:tc>
@@ -169,16 +115,7 @@
             <w:shd w:fill="156A84"/>
           </w:tcPr>
           <w:p>
-            <w:pPr>
-              <w:spacing w:after="0" w:before="0" w:line="240" w:lineRule="auto"/>
-              <w:jc w:val="center"/>
-            </w:pPr>
-            <w:r/>
             <w:r>
-              <w:rPr>
-                <w:b/>
-                <w:sz w:val="15"/>
-              </w:rPr>
               <w:t>Additional Information</w:t>
             </w:r>
           </w:p>

</xml_diff>